<commit_message>
Update Callum Wyndham - VersionControl.docx
</commit_message>
<xml_diff>
--- a/Callum Wyndham - VersionControl.docx
+++ b/Callum Wyndham - VersionControl.docx
@@ -255,6 +255,7 @@
           </w:pPr>
           <w:r>
             <w:rPr>
+              <w:noProof/>
               <w:color w:val="FF0000"/>
             </w:rPr>
             <w:drawing>
@@ -350,21 +351,12 @@
               <w:rPr>
                 <w:rStyle w:val="Hyperlink"/>
               </w:rPr>
-              <w:t>https://github.com/Callu</w:t>
-            </w:r>
-            <w:r>
-              <w:rPr>
-                <w:rStyle w:val="Hyperlink"/>
-              </w:rPr>
-              <w:t>m</w:t>
-            </w:r>
-            <w:r>
-              <w:rPr>
-                <w:rStyle w:val="Hyperlink"/>
-              </w:rPr>
-              <w:t>Wyn/Classwork-2026/pull/1/commits</w:t>
+              <w:t>https://github.com/CallumWyn/Classwork-2026/commit/4478a38e7ad87f9d56521ca56f800ac184d90719</w:t>
             </w:r>
           </w:hyperlink>
+          <w:r>
+            <w:t xml:space="preserve"> </w:t>
+          </w:r>
         </w:sdtContent>
       </w:sdt>
     </w:p>
@@ -375,17 +367,23 @@
     </w:p>
     <w:sdt>
       <w:sdtPr>
+        <w:rPr>
+          <w:noProof/>
+        </w:rPr>
         <w:id w:val="557513381"/>
         <w:picture/>
       </w:sdtPr>
       <w:sdtContent>
         <w:p>
           <w:r>
+            <w:rPr>
+              <w:noProof/>
+            </w:rPr>
             <w:drawing>
-              <wp:inline distT="0" distB="0" distL="0" distR="0" wp14:anchorId="4E398D38" wp14:editId="3B8B2816">
-                <wp:extent cx="5731510" cy="1235075"/>
-                <wp:effectExtent l="0" t="0" r="2540" b="3175"/>
-                <wp:docPr id="867005822" name="Picture 1"/>
+              <wp:inline distT="0" distB="0" distL="0" distR="0" wp14:anchorId="478152C5" wp14:editId="206CB6C6">
+                <wp:extent cx="4457700" cy="2696548"/>
+                <wp:effectExtent l="0" t="0" r="0" b="8890"/>
+                <wp:docPr id="1284994833" name="Picture 1"/>
                 <wp:cNvGraphicFramePr>
                   <a:graphicFrameLocks xmlns:a="http://schemas.openxmlformats.org/drawingml/2006/main" noChangeAspect="1"/>
                 </wp:cNvGraphicFramePr>
@@ -393,23 +391,32 @@
                   <a:graphicData uri="http://schemas.openxmlformats.org/drawingml/2006/picture">
                     <pic:pic xmlns:pic="http://schemas.openxmlformats.org/drawingml/2006/picture">
                       <pic:nvPicPr>
-                        <pic:cNvPr id="867005822" name=""/>
+                        <pic:cNvPr id="1284994833" name=""/>
                         <pic:cNvPicPr/>
                       </pic:nvPicPr>
-                      <pic:blipFill>
+                      <pic:blipFill rotWithShape="1">
                         <a:blip r:embed="rId13"/>
+                        <a:srcRect b="23615"/>
                         <a:stretch>
                           <a:fillRect/>
                         </a:stretch>
                       </pic:blipFill>
-                      <pic:spPr>
+                      <pic:spPr bwMode="auto">
                         <a:xfrm>
                           <a:off x="0" y="0"/>
-                          <a:ext cx="5731510" cy="1235075"/>
+                          <a:ext cx="4472534" cy="2705521"/>
                         </a:xfrm>
                         <a:prstGeom prst="rect">
                           <a:avLst/>
                         </a:prstGeom>
+                        <a:ln>
+                          <a:noFill/>
+                        </a:ln>
+                        <a:extLst>
+                          <a:ext uri="{53640926-AAD7-44D8-BBD7-CCE9431645EC}">
+                            <a14:shadowObscured xmlns:a14="http://schemas.microsoft.com/office/drawing/2010/main"/>
+                          </a:ext>
+                        </a:extLst>
                       </pic:spPr>
                     </pic:pic>
                   </a:graphicData>
@@ -420,11 +427,6 @@
         </w:p>
       </w:sdtContent>
     </w:sdt>
-    <w:p>
-      <w:pPr>
-        <w:pStyle w:val="Heading1"/>
-      </w:pPr>
-    </w:p>
     <w:p>
       <w:pPr>
         <w:pStyle w:val="Heading1"/>
@@ -453,7 +455,19 @@
               <w:rPr>
                 <w:rStyle w:val="Hyperlink"/>
               </w:rPr>
-              <w:t>https://github.com/CallumWyn/Classwork-2026/pull/1</w:t>
+              <w:t>https://github.com/CallumWyn/Classwork-2026/p</w:t>
+            </w:r>
+            <w:r>
+              <w:rPr>
+                <w:rStyle w:val="Hyperlink"/>
+              </w:rPr>
+              <w:t>u</w:t>
+            </w:r>
+            <w:r>
+              <w:rPr>
+                <w:rStyle w:val="Hyperlink"/>
+              </w:rPr>
+              <w:t>ll/1</w:t>
             </w:r>
           </w:hyperlink>
         </w:sdtContent>
@@ -472,8 +486,11 @@
       <w:sdtContent>
         <w:p>
           <w:r>
+            <w:rPr>
+              <w:noProof/>
+            </w:rPr>
             <w:drawing>
-              <wp:inline distT="0" distB="0" distL="0" distR="0" wp14:anchorId="74860EED" wp14:editId="64F3D7CF">
+              <wp:inline distT="0" distB="0" distL="0" distR="0" wp14:anchorId="74860EED" wp14:editId="295F0C93">
                 <wp:extent cx="5731510" cy="3750945"/>
                 <wp:effectExtent l="0" t="0" r="2540" b="1905"/>
                 <wp:docPr id="593915780" name="Picture 1"/>
@@ -517,10 +534,6 @@
         <w:pStyle w:val="Heading1"/>
       </w:pPr>
       <w:r>
-        <w:br w:type="page"/>
-      </w:r>
-      <w:r>
-        <w:lastRenderedPageBreak/>
         <w:t>Resources:</w:t>
       </w:r>
     </w:p>
@@ -3408,7 +3421,9 @@
   </w:compat>
   <w:rsids>
     <w:rsidRoot w:val="00D1226A"/>
+    <w:rsid w:val="00606DE5"/>
     <w:rsid w:val="00675FF6"/>
+    <w:rsid w:val="00751F9A"/>
     <w:rsid w:val="008A3ABC"/>
     <w:rsid w:val="00B56AD6"/>
     <w:rsid w:val="00BA12DB"/>
@@ -3925,91 +3940,6 @@
       <w:lang w:eastAsia="en-US"/>
     </w:rPr>
   </w:style>
-  <w:style w:type="paragraph" w:customStyle="1" w:styleId="B8D516889DAA49C382A1648045C7EF4E">
-    <w:name w:val="B8D516889DAA49C382A1648045C7EF4E"/>
-    <w:rsid w:val="00B56AD6"/>
-    <w:pPr>
-      <w:spacing w:after="200" w:line="276" w:lineRule="auto"/>
-      <w:ind w:left="720"/>
-      <w:contextualSpacing/>
-    </w:pPr>
-    <w:rPr>
-      <w:lang w:eastAsia="en-US"/>
-    </w:rPr>
-  </w:style>
-  <w:style w:type="paragraph" w:customStyle="1" w:styleId="5A9145CE42C8478BBCCB1CEE0E4F4481">
-    <w:name w:val="5A9145CE42C8478BBCCB1CEE0E4F4481"/>
-    <w:rsid w:val="00B56AD6"/>
-    <w:pPr>
-      <w:spacing w:after="200" w:line="276" w:lineRule="auto"/>
-      <w:ind w:left="720"/>
-      <w:contextualSpacing/>
-    </w:pPr>
-    <w:rPr>
-      <w:lang w:eastAsia="en-US"/>
-    </w:rPr>
-  </w:style>
-  <w:style w:type="paragraph" w:customStyle="1" w:styleId="CF6031E566304451A8943E7D31AA1C52">
-    <w:name w:val="CF6031E566304451A8943E7D31AA1C52"/>
-    <w:rsid w:val="00B56AD6"/>
-    <w:pPr>
-      <w:spacing w:after="200" w:line="276" w:lineRule="auto"/>
-      <w:ind w:left="720"/>
-      <w:contextualSpacing/>
-    </w:pPr>
-    <w:rPr>
-      <w:lang w:eastAsia="en-US"/>
-    </w:rPr>
-  </w:style>
-  <w:style w:type="paragraph" w:customStyle="1" w:styleId="B8B605B505684E51BD858D66783BDF7F">
-    <w:name w:val="B8B605B505684E51BD858D66783BDF7F"/>
-    <w:rsid w:val="00B56AD6"/>
-    <w:pPr>
-      <w:spacing w:after="200" w:line="276" w:lineRule="auto"/>
-      <w:ind w:left="720"/>
-      <w:contextualSpacing/>
-    </w:pPr>
-    <w:rPr>
-      <w:lang w:eastAsia="en-US"/>
-    </w:rPr>
-  </w:style>
-  <w:style w:type="paragraph" w:customStyle="1" w:styleId="ACFCCD54B4D1492EAA109C300B9CCF7A">
-    <w:name w:val="ACFCCD54B4D1492EAA109C300B9CCF7A"/>
-    <w:rsid w:val="00B56AD6"/>
-    <w:pPr>
-      <w:spacing w:after="200" w:line="276" w:lineRule="auto"/>
-      <w:ind w:left="720"/>
-      <w:contextualSpacing/>
-    </w:pPr>
-    <w:rPr>
-      <w:lang w:eastAsia="en-US"/>
-    </w:rPr>
-  </w:style>
-  <w:style w:type="paragraph" w:customStyle="1" w:styleId="43832A401D544A11B2E3CAE6030736EA">
-    <w:name w:val="43832A401D544A11B2E3CAE6030736EA"/>
-    <w:rsid w:val="00B56AD6"/>
-    <w:pPr>
-      <w:spacing w:after="200" w:line="276" w:lineRule="auto"/>
-      <w:ind w:left="720"/>
-      <w:contextualSpacing/>
-    </w:pPr>
-    <w:rPr>
-      <w:lang w:eastAsia="en-US"/>
-    </w:rPr>
-  </w:style>
-  <w:style w:type="paragraph" w:customStyle="1" w:styleId="31233A2CCF8741039C90356BF6E23875">
-    <w:name w:val="31233A2CCF8741039C90356BF6E23875"/>
-    <w:rsid w:val="00675FF6"/>
-    <w:pPr>
-      <w:spacing w:line="278" w:lineRule="auto"/>
-    </w:pPr>
-    <w:rPr>
-      <w:kern w:val="2"/>
-      <w:sz w:val="24"/>
-      <w:szCs w:val="24"/>
-      <w14:ligatures w14:val="standardContextual"/>
-    </w:rPr>
-  </w:style>
 </w:styles>
 </file>
 

</xml_diff>